<commit_message>
docs(curriculum): fix dynamic support visual observation questions
Co-Authored-By: Claude Sonnet 5 <noreply@anthropic.com>
</commit_message>
<xml_diff>
--- a/docs/seance-2-modele-validation/S02_APP_VI_ALL_support-visuel.docx
+++ b/docs/seance-2-modele-validation/S02_APP_VI_ALL_support-visuel.docx
@@ -179,7 +179,7 @@
           <w:sz w:val="22"/>
           <w:szCs w:val="22"/>
         </w:rPr>
-        <w:t xml:space="preserve">q1. Citez les trois premiers thèmes civiques mentionnés sur le schéma :</w:t>
+        <w:t xml:space="preserve">q1. Citez les quatre informations demandées dans le formulaire d'état civil :</w:t>
       </w:r>
     </w:p>
     <w:p>
@@ -211,7 +211,7 @@
           <w:sz w:val="22"/>
           <w:szCs w:val="22"/>
         </w:rPr>
-        <w:t xml:space="preserve">q2. Quel est le rôle principal de ces thèmes civiques d'après le formateur ?</w:t>
+        <w:t xml:space="preserve">q2. Que représente le drapeau tricolore affiché à côté du formulaire ?</w:t>
       </w:r>
     </w:p>
     <w:p>

</xml_diff>